<commit_message>
Add project problem content and update legal drafts
</commit_message>
<xml_diff>
--- a/OSai_Work_Hub_Terms_of_Use_Draft.docx
+++ b/OSai_Work_Hub_Terms_of_Use_Draft.docx
@@ -45,6 +45,9 @@
         <w:gridCol w:w="7460"/>
       </w:tblGrid>
       <w:tr>
+        <w:trPr>
+          <w:tblHeader w:val="true"/>
+        </w:trPr>
         <w:tc>
           <w:tcPr>
             <w:tcW w:type="dxa" w:w="1900"/>
@@ -155,7 +158,7 @@
                 <w:color w:val="0C1B2A"/>
                 <w:sz w:val="19"/>
               </w:rPr>
-              <w:t>July 28, 2026</w:t>
+              <w:t>July 30, 2026</w:t>
             </w:r>
           </w:p>
         </w:tc>
@@ -271,7 +274,7 @@
                 <w:color w:val="0C1B2A"/>
                 <w:sz w:val="19"/>
               </w:rPr>
-              <w:t>[INSERT LEGAL ENTITY NAME], operating the OSai Work Hub</w:t>
+              <w:t>Orbit Systems Ai, LLC, operating the OSai Work Hub</w:t>
             </w:r>
           </w:p>
         </w:tc>
@@ -294,6 +297,9 @@
         <w:gridCol w:w="9360"/>
       </w:tblGrid>
       <w:tr>
+        <w:trPr>
+          <w:tblHeader w:val="true"/>
+        </w:trPr>
         <w:tc>
           <w:tcPr>
             <w:tcW w:type="dxa" w:w="9360"/>
@@ -352,7 +358,7 @@
           <w:color w:val="1A1A1A"/>
           <w:sz w:val="22"/>
         </w:rPr>
-        <w:t>These Terms of Use (the “Terms”) govern your access to and use of the OSai Work Hub, its public pages, authenticated member areas, protected project rooms, beta programs, feedback tools, communications, files, videos, decks, and related services (collectively, the “Hub”). The Hub is operated by [INSERT LEGAL ENTITY NAME] (“OSai,” “we,” “us,” or “our”).</w:t>
+        <w:t>These Terms of Use (the “Terms”) govern your access to and use of the OSai Work Hub, its public pages, authenticated member areas, protected project rooms, beta programs, feedback tools, communications, files, videos, decks, and related services (collectively, the “Hub”). The Hub is operated by Orbit Systems Ai, LLC (“Orbit Systems,” “OSai,” “we,” “us,” or “our”).</w:t>
       </w:r>
     </w:p>
     <w:p>
@@ -960,6 +966,19 @@
       </w:r>
     </w:p>
     <w:p>
+      <w:pPr/>
+      <w:r>
+        <w:rPr>
+          <w:rFonts w:ascii="Aptos" w:hAnsi="Aptos"/>
+          <w:b w:val="0"/>
+          <w:i w:val="0"/>
+          <w:color w:val="1A1A1A"/>
+          <w:sz w:val="22"/>
+        </w:rPr>
+        <w:t>After OSai verifies a deletion request and, if necessary, clarifies its scope, OSai will delete or de-identify the covered personal information from active systems within 30 days and will direct applicable service providers to do the same. This commitment does not apply to information OSai must or is permitted to retain for a lawful purpose, including legal compliance, transactions or requested services, security and fraud prevention, agreement and audit records, legal claims, and protection of rights or safety. Any retained information will be used only for the applicable exception and deleted or de-identified when that exception ends. Backup copies may remain protected until overwritten under the ordinary backup cycle and will not be restored to active use except for disaster recovery, security, or legal compliance. The Privacy Notice provides the controlling details and request method.</w:t>
+      </w:r>
+    </w:p>
+    <w:p>
       <w:pPr>
         <w:pStyle w:val="Heading1"/>
       </w:pPr>
@@ -1060,6 +1079,9 @@
         <w:gridCol w:w="9360"/>
       </w:tblGrid>
       <w:tr>
+        <w:trPr>
+          <w:tblHeader w:val="true"/>
+        </w:trPr>
         <w:tc>
           <w:tcPr>
             <w:tcW w:type="dxa" w:w="9360"/>
@@ -1131,7 +1153,7 @@
           <w:color w:val="1A1A1A"/>
           <w:sz w:val="22"/>
         </w:rPr>
-        <w:t>TO THE MAXIMUM EXTENT PERMITTED BY LAW, THE AGGREGATE LIABILITY OF THOSE PARTIES FOR ALL CLAIMS ARISING FROM OR RELATED TO THE HUB WILL NOT EXCEED THE GREATER OF (A) THE AMOUNT YOU PAID OSAI SPECIFICALLY FOR USE OF THE HUB IN THE 12 MONTHS BEFORE THE EVENT GIVING RISE TO THE CLAIM OR (B) [INSERT COUNSEL-APPROVED FLOOR]. These limits do not apply where prohibited, including to liability that cannot legally be limited.</w:t>
+        <w:t>TO THE MAXIMUM EXTENT PERMITTED BY LAW, IN NO EVENT WILL THE AGGREGATE LIABILITY OF ORBIT SYSTEMS AI, LLC AND ITS AFFILIATES, LICENSORS, SERVICE PROVIDERS, OFFICERS, DIRECTORS, EMPLOYEES, AND AGENTS FOR ALL CLAIMS ARISING OUT OF OR RELATING TO THE HUB OR THESE TERMS EXCEED THE TOTAL AMOUNT YOU PAID TO ORBIT SYSTEMS AI, LLC FOR ACCESS TO OR USE OF THE HUB. These exclusions and limitations apply regardless of the legal theory asserted and even if a remedy fails of its essential purpose. They do not exclude or limit liability that cannot lawfully be excluded or limited.</w:t>
       </w:r>
     </w:p>
     <w:p>
@@ -1152,7 +1174,7 @@
           <w:color w:val="1A1A1A"/>
           <w:sz w:val="22"/>
         </w:rPr>
-        <w:t>To the extent permitted by law, you will defend, indemnify, and hold harmless OSai and its affiliates, licensors, service providers, officers, directors, employees, and agents from third-party claims, damages, judgments, losses, liabilities, costs, and expenses (including reasonable legal fees) arising from your unlawful or unauthorized use of the Hub, your submissions, your breach of these Terms or another applicable agreement, or your infringement or violation of another person’s rights. This obligation does not apply to the extent a claim results from OSai’s own breach, negligence, or willful misconduct.</w:t>
+        <w:t>To the maximum extent permitted by law, you agree to defend, indemnify, and hold harmless Orbit Systems Ai, LLC and its affiliates, licensors, service providers, officers, directors, employees, agents, successors, and assigns from and against any third-party claims, demands, actions, proceedings, damages, judgments, settlements, losses, liabilities, penalties, costs, and expenses (including reasonable attorneys’ fees) arising out of or relating to: (a) your access to, use of, or misuse of the Hub; (b) your submissions or other content you provide; (c) your breach of these Terms or another applicable agreement; (d) your violation of applicable law; or (e) your infringement, misappropriation, or violation of another person’s rights. Orbit Systems Ai, LLC will provide reasonable notice of an indemnified claim and may control its defense and settlement. You may not settle a claim in a manner that admits fault by, imposes obligations on, or otherwise adversely affects Orbit Systems Ai, LLC without its prior written consent. This obligation does not apply to the extent a claim is caused by Orbit Systems Ai, LLC’s own negligence, willful misconduct, or breach of these Terms.</w:t>
       </w:r>
     </w:p>
     <w:p>
@@ -1173,7 +1195,7 @@
           <w:color w:val="1A1A1A"/>
           <w:sz w:val="22"/>
         </w:rPr>
-        <w:t>These Terms are governed by the laws of [INSERT STATE/COUNTRY], without regard to conflict-of-laws principles. The courts located in [INSERT COUNTY, STATE/COUNTRY] will have exclusive jurisdiction and venue, unless applicable law requires otherwise. [COUNSEL: DECIDE WHETHER TO ADD INFORMAL RESOLUTION, ARBITRATION, CLASS-ACTION WAIVER, SMALL-CLAIMS, AND OPT-OUT TERMS.]</w:t>
+        <w:t>These Terms and any dispute arising out of or relating to them or the Hub are governed by the laws of [INSERT STATE/COUNTRY], without regard to its conflict-of-laws rules. Subject to any mandatory law that applies to you, the state and federal courts located in [INSERT COUNTY, STATE/COUNTRY] will have exclusive jurisdiction and venue, and you and Orbit Systems Ai, LLC consent to the personal jurisdiction of those courts. [COUNSEL: CONFIRM THE GOVERNING LAW AND VENUE, AND DECIDE WHETHER TO ADD INFORMAL RESOLUTION, ARBITRATION, CLASS-ACTION WAIVER, SMALL-CLAIMS, AND OPT-OUT TERMS.]</w:t>
       </w:r>
     </w:p>
     <w:p>
@@ -1243,7 +1265,7 @@
           <w:color w:val="1A1A1A"/>
           <w:sz w:val="22"/>
         </w:rPr>
-        <w:t>[INSERT LEGAL ENTITY NAME]</w:t>
+        <w:t>Orbit Systems Ai, LLC</w:t>
       </w:r>
     </w:p>
     <w:p>
@@ -1339,7 +1361,7 @@
           <w:color w:val="1A1A1A"/>
           <w:sz w:val="22"/>
         </w:rPr>
-        <w:t>Confirm the legal entity that operates the Hub, owns relevant projects/content, and signs agreements; confirm how “Orbit Systems” and “OSai” relate legally.</w:t>
+        <w:t>Confirm that “Orbit Systems Ai, LLC” is the exact registered legal name and confirm how the OSai brand relates to that entity.</w:t>
       </w:r>
     </w:p>
     <w:p>
@@ -1414,7 +1436,7 @@
           <w:color w:val="1A1A1A"/>
           <w:sz w:val="22"/>
         </w:rPr>
-        <w:t>Publish the Privacy Notice; approve retention/deletion rules, cookies/analytics, AI-assisted feedback analysis, screenshots, device/session context, and data-subject request handling.</w:t>
+        <w:t>Publish the Privacy Notice; implement and test the 30-day deletion workflow across active systems and service providers; approve deletion exceptions, backup-cycle handling, retention schedules, cookies/analytics, AI-assisted feedback analysis, screenshots, device/session context, and data-subject request handling.</w:t>
       </w:r>
     </w:p>
     <w:p>
@@ -1489,7 +1511,7 @@
           <w:color w:val="1A1A1A"/>
           <w:sz w:val="22"/>
         </w:rPr>
-        <w:t>Approve warranty disclaimers, liability cap and floor, indemnity, excluded claims, consumer-law carveouts, and any paid-service treatment.</w:t>
+        <w:t>Approve warranty disclaimers, the amount-paid liability cap, indemnity, excluded claims, consumer-law carveouts, and any paid-service treatment.</w:t>
       </w:r>
     </w:p>
     <w:p>
@@ -1614,7 +1636,7 @@
           <w:color w:val="1A1A1A"/>
           <w:sz w:val="22"/>
         </w:rPr>
-        <w:t>Insert legal name, postal address, legal email, privacy contact, security contact, and canonical URLs.</w:t>
+        <w:t>Confirm the exact legal name and insert the postal address, legal email, privacy contact, security contact, and canonical URLs.</w:t>
       </w:r>
     </w:p>
     <w:p>
@@ -1664,7 +1686,7 @@
         <w:color w:val="55677B"/>
         <w:sz w:val="17"/>
       </w:rPr>
-      <w:t xml:space="preserve">Draft for legal review  •  July 28, 2026  •  Page </w:t>
+      <w:t xml:space="preserve">Draft for legal review  •  July 30, 2026  •  Page </w:t>
     </w:r>
     <w:r>
       <w:rPr>

</xml_diff>